<commit_message>
docs(ai설계서): 통합본에 'LLM(Gemini) 적용' 섹션 추가 + Claude→Gemini 정정
통합본에 4. LLM(Gemini) 적용 신설(4.1 적용 패턴/4.2 모듈별 적용/4.3 동시 적용·
공통 메커니즘/4.4 설계 판단), 기존 4.공통운영정보→5.로 재번호. 1.전체구성 표의
챗봇 'Claude LLM+폴백/폴백(키대기)'→'Gemini LLM+폴백/운영(Gemini)', 5)챗봇 요약
'Claude API'→'Gemini API'로 정정. 표지/병합 PDF 재생성(로고 유지, 병합 19p).

Co-Authored-By: Claude Opus 4.8 (1M context) <noreply@anthropic.com>
</commit_message>
<xml_diff>
--- a/CareAnd-AI-설계문서-통합본.docx
+++ b/CareAnd-AI-설계문서-통합본.docx
@@ -863,16 +863,8 @@
             <w:vAlign w:val="center"/>
           </w:tcPr>
           <w:p>
-            <w:pPr>
-              <w:spacing w:after="20" w:line="252" w:lineRule="auto"/>
-            </w:pPr>
-            <w:r>
-              <w:rPr>
-                <w:rFonts w:ascii="맑은 고딕" w:hAnsi="맑은 고딕" w:eastAsia="맑은 고딕"/>
-                <w:sz w:val="18"/>
-                <w:szCs w:val="18"/>
-              </w:rPr>
-              <w:t xml:space="preserve">Claude LLM + 폴백</w:t>
+            <w:r>
+              <w:t>Gemini LLM + 폴백</w:t>
             </w:r>
           </w:p>
         </w:tc>
@@ -901,16 +893,8 @@
             <w:vAlign w:val="center"/>
           </w:tcPr>
           <w:p>
-            <w:pPr>
-              <w:spacing w:after="20" w:line="252" w:lineRule="auto"/>
-            </w:pPr>
-            <w:r>
-              <w:rPr>
-                <w:rFonts w:ascii="맑은 고딕" w:hAnsi="맑은 고딕" w:eastAsia="맑은 고딕"/>
-                <w:sz w:val="18"/>
-                <w:szCs w:val="18"/>
-              </w:rPr>
-              <w:t xml:space="preserve">폴백(키 대기)</w:t>
+            <w:r>
+              <w:t>운영(Gemini)</w:t>
             </w:r>
           </w:p>
         </w:tc>
@@ -1576,10 +1560,706 @@
         <w:spacing w:after="120" w:line="276" w:lineRule="auto"/>
       </w:pPr>
       <w:r>
-        <w:rPr>
-          <w:rFonts w:ascii="맑은 고딕" w:hAnsi="맑은 고딕" w:eastAsia="맑은 고딕"/>
-        </w:rPr>
-        <w:t xml:space="preserve">장기요양 상담 챗봇과 산후조리 챗봇을 Claude API로 제공하되, 키 미설정·실패 시 지식베이스 안내문/규칙 기반 답변으로 폴백한다. 의료 판단·위험 신호는 의료진 상담을 최우선 권고한다.</w:t>
+        <w:t>장기요양 상담 챗봇과 산후조리 챗봇을 Gemini API로 제공하되, 키 미설정·실패 시 지식베이스 안내문/규칙 기반 답변으로 폴백한다. 의료 판단·위험 신호는 의료진 상담을 최우선 권고한다.</w:t>
+      </w:r>
+    </w:p>
+    <w:p>
+      <w:pPr>
+        <w:pStyle w:val="Heading1"/>
+      </w:pPr>
+      <w:r>
+        <w:rPr>
+          <w:b w:val="0"/>
+        </w:rPr>
+        <w:t>4. LLM(Gemini) 적용</w:t>
+      </w:r>
+    </w:p>
+    <w:p>
+      <w:pPr/>
+      <w:r>
+        <w:rPr>
+          <w:b w:val="0"/>
+        </w:rPr>
+        <w:t>LLM 기능은 프로바이더 선택형(LLM_PROVIDER)으로 구현되며 현재 Google Gemini(gemini-2.5-flash)를 사용한다(Anthropic 크레딧 소진 우회, Anthropic 경로도 코드상 유지). 적용은 3가지 패턴으로 나뉜다 — ① 순수 생성 ② 하이브리드(결정적 코어 + Gemini 설명) ③ 프로바이더 옵션(STT). 핵심 원칙은 '판정·순위·예측·수치는 결정적 코어가, 표현·설명·상담·생성·전사는 Gemini가' 담당하는 것이다.</w:t>
+      </w:r>
+    </w:p>
+    <w:p>
+      <w:pPr>
+        <w:pStyle w:val="Heading2"/>
+      </w:pPr>
+      <w:r>
+        <w:rPr>
+          <w:b w:val="0"/>
+        </w:rPr>
+        <w:t>4.1 적용 패턴</w:t>
+      </w:r>
+    </w:p>
+    <w:tbl>
+      <w:tblPr>
+        <w:tblW w:type="auto" w:w="0"/>
+        <w:tblLook w:firstColumn="1" w:firstRow="1" w:lastColumn="0" w:lastRow="0" w:noHBand="0" w:noVBand="1" w:val="04A0"/>
+      </w:tblPr>
+      <w:tblGrid>
+        <w:gridCol w:w="3213"/>
+        <w:gridCol w:w="3213"/>
+        <w:gridCol w:w="3213"/>
+      </w:tblGrid>
+      <w:tr>
+        <w:tc>
+          <w:tcPr>
+            <w:tcW w:type="dxa" w:w="3213"/>
+          </w:tcPr>
+          <w:p>
+            <w:r/>
+            <w:r>
+              <w:rPr>
+                <w:b/>
+              </w:rPr>
+              <w:t>패턴</w:t>
+            </w:r>
+          </w:p>
+        </w:tc>
+        <w:tc>
+          <w:tcPr>
+            <w:tcW w:type="dxa" w:w="3213"/>
+          </w:tcPr>
+          <w:p>
+            <w:r/>
+            <w:r>
+              <w:rPr>
+                <w:b/>
+              </w:rPr>
+              <w:t>의미</w:t>
+            </w:r>
+          </w:p>
+        </w:tc>
+        <w:tc>
+          <w:tcPr>
+            <w:tcW w:type="dxa" w:w="3213"/>
+          </w:tcPr>
+          <w:p>
+            <w:r/>
+            <w:r>
+              <w:rPr>
+                <w:b/>
+              </w:rPr>
+              <w:t>적용 모듈</w:t>
+            </w:r>
+          </w:p>
+        </w:tc>
+      </w:tr>
+      <w:tr>
+        <w:tc>
+          <w:tcPr>
+            <w:tcW w:type="dxa" w:w="3213"/>
+          </w:tcPr>
+          <w:p>
+            <w:r>
+              <w:t>A. 순수 생성</w:t>
+            </w:r>
+          </w:p>
+        </w:tc>
+        <w:tc>
+          <w:tcPr>
+            <w:tcW w:type="dxa" w:w="3213"/>
+          </w:tcPr>
+          <w:p>
+            <w:r>
+              <w:t>출력 자체가 LLM 결과</w:t>
+            </w:r>
+          </w:p>
+        </w:tc>
+        <w:tc>
+          <w:tcPr>
+            <w:tcW w:type="dxa" w:w="3213"/>
+          </w:tcPr>
+          <w:p>
+            <w:r>
+              <w:t>챗봇·산후챗봇·일지요약·일지생성</w:t>
+            </w:r>
+          </w:p>
+        </w:tc>
+      </w:tr>
+      <w:tr>
+        <w:tc>
+          <w:tcPr>
+            <w:tcW w:type="dxa" w:w="3213"/>
+          </w:tcPr>
+          <w:p>
+            <w:r>
+              <w:t>B. 하이브리드</w:t>
+            </w:r>
+          </w:p>
+        </w:tc>
+        <w:tc>
+          <w:tcPr>
+            <w:tcW w:type="dxa" w:w="3213"/>
+          </w:tcPr>
+          <w:p>
+            <w:r>
+              <w:t>결정적 코어가 판정/순위/예측, Gemini는 설명만 덧붙임</w:t>
+            </w:r>
+          </w:p>
+        </w:tc>
+        <w:tc>
+          <w:tcPr>
+            <w:tcW w:type="dxa" w:w="3213"/>
+          </w:tcPr>
+          <w:p>
+            <w:r>
+              <w:t>매칭추천·산후매칭·이상징후·수요예측</w:t>
+            </w:r>
+          </w:p>
+        </w:tc>
+      </w:tr>
+      <w:tr>
+        <w:tc>
+          <w:tcPr>
+            <w:tcW w:type="dxa" w:w="3213"/>
+          </w:tcPr>
+          <w:p>
+            <w:r>
+              <w:t>C. 프로바이더 옵션</w:t>
+            </w:r>
+          </w:p>
+        </w:tc>
+        <w:tc>
+          <w:tcPr>
+            <w:tcW w:type="dxa" w:w="3213"/>
+          </w:tcPr>
+          <w:p>
+            <w:r>
+              <w:t>엔진 자체를 교체 가능</w:t>
+            </w:r>
+          </w:p>
+        </w:tc>
+        <w:tc>
+          <w:tcPr>
+            <w:tcW w:type="dxa" w:w="3213"/>
+          </w:tcPr>
+          <w:p>
+            <w:r>
+              <w:t>STT (whisper 기본 / gemini)</w:t>
+            </w:r>
+          </w:p>
+        </w:tc>
+      </w:tr>
+    </w:tbl>
+    <w:p>
+      <w:pPr>
+        <w:pStyle w:val="Heading2"/>
+      </w:pPr>
+      <w:r>
+        <w:rPr>
+          <w:b w:val="0"/>
+        </w:rPr>
+        <w:t>4.2 모듈별 적용</w:t>
+      </w:r>
+    </w:p>
+    <w:tbl>
+      <w:tblPr>
+        <w:tblW w:type="auto" w:w="0"/>
+        <w:tblLook w:firstColumn="1" w:firstRow="1" w:lastColumn="0" w:lastRow="0" w:noHBand="0" w:noVBand="1" w:val="04A0"/>
+      </w:tblPr>
+      <w:tblGrid>
+        <w:gridCol w:w="2409"/>
+        <w:gridCol w:w="2409"/>
+        <w:gridCol w:w="2409"/>
+        <w:gridCol w:w="2409"/>
+      </w:tblGrid>
+      <w:tr>
+        <w:tc>
+          <w:tcPr>
+            <w:tcW w:type="dxa" w:w="2409"/>
+          </w:tcPr>
+          <w:p>
+            <w:r/>
+            <w:r>
+              <w:rPr>
+                <w:b/>
+              </w:rPr>
+              <w:t>모듈</w:t>
+            </w:r>
+          </w:p>
+        </w:tc>
+        <w:tc>
+          <w:tcPr>
+            <w:tcW w:type="dxa" w:w="2409"/>
+          </w:tcPr>
+          <w:p>
+            <w:r/>
+            <w:r>
+              <w:rPr>
+                <w:b/>
+              </w:rPr>
+              <w:t>코어(결정적)</w:t>
+            </w:r>
+          </w:p>
+        </w:tc>
+        <w:tc>
+          <w:tcPr>
+            <w:tcW w:type="dxa" w:w="2409"/>
+          </w:tcPr>
+          <w:p>
+            <w:r/>
+            <w:r>
+              <w:rPr>
+                <w:b/>
+              </w:rPr>
+              <w:t>Gemini 적용</w:t>
+            </w:r>
+          </w:p>
+        </w:tc>
+        <w:tc>
+          <w:tcPr>
+            <w:tcW w:type="dxa" w:w="2409"/>
+          </w:tcPr>
+          <w:p>
+            <w:r/>
+            <w:r>
+              <w:rPr>
+                <w:b/>
+              </w:rPr>
+              <w:t>LLM 실패 시</w:t>
+            </w:r>
+          </w:p>
+        </w:tc>
+      </w:tr>
+      <w:tr>
+        <w:tc>
+          <w:tcPr>
+            <w:tcW w:type="dxa" w:w="2409"/>
+          </w:tcPr>
+          <w:p>
+            <w:r>
+              <w:t>일반·산후 챗봇</w:t>
+            </w:r>
+          </w:p>
+        </w:tc>
+        <w:tc>
+          <w:tcPr>
+            <w:tcW w:type="dxa" w:w="2409"/>
+          </w:tcPr>
+          <w:p>
+            <w:r>
+              <w:t>—</w:t>
+            </w:r>
+          </w:p>
+        </w:tc>
+        <w:tc>
+          <w:tcPr>
+            <w:tcW w:type="dxa" w:w="2409"/>
+          </w:tcPr>
+          <w:p>
+            <w:r>
+              <w:t>답변 생성(컨텍스트 반영)</w:t>
+            </w:r>
+          </w:p>
+        </w:tc>
+        <w:tc>
+          <w:tcPr>
+            <w:tcW w:type="dxa" w:w="2409"/>
+          </w:tcPr>
+          <w:p>
+            <w:r>
+              <w:t>규칙/KB 폴백</w:t>
+            </w:r>
+          </w:p>
+        </w:tc>
+      </w:tr>
+      <w:tr>
+        <w:tc>
+          <w:tcPr>
+            <w:tcW w:type="dxa" w:w="2409"/>
+          </w:tcPr>
+          <w:p>
+            <w:r>
+              <w:t>일지요약</w:t>
+            </w:r>
+          </w:p>
+        </w:tc>
+        <w:tc>
+          <w:tcPr>
+            <w:tcW w:type="dxa" w:w="2409"/>
+          </w:tcPr>
+          <w:p>
+            <w:r>
+              <w:t>—</w:t>
+            </w:r>
+          </w:p>
+        </w:tc>
+        <w:tc>
+          <w:tcPr>
+            <w:tcW w:type="dxa" w:w="2409"/>
+          </w:tcPr>
+          <w:p>
+            <w:r>
+              <w:t>보호자·의료진 요약(JSON)</w:t>
+            </w:r>
+          </w:p>
+        </w:tc>
+        <w:tc>
+          <w:tcPr>
+            <w:tcW w:type="dxa" w:w="2409"/>
+          </w:tcPr>
+          <w:p>
+            <w:r>
+              <w:t>heuristic 폴백</w:t>
+            </w:r>
+          </w:p>
+        </w:tc>
+      </w:tr>
+      <w:tr>
+        <w:tc>
+          <w:tcPr>
+            <w:tcW w:type="dxa" w:w="2409"/>
+          </w:tcPr>
+          <w:p>
+            <w:r>
+              <w:t>일지생성</w:t>
+            </w:r>
+          </w:p>
+        </w:tc>
+        <w:tc>
+          <w:tcPr>
+            <w:tcW w:type="dxa" w:w="2409"/>
+          </w:tcPr>
+          <w:p>
+            <w:r>
+              <w:t>—</w:t>
+            </w:r>
+          </w:p>
+        </w:tc>
+        <w:tc>
+          <w:tcPr>
+            <w:tcW w:type="dxa" w:w="2409"/>
+          </w:tcPr>
+          <w:p>
+            <w:r>
+              <w:t>보호자·의료진 일지</w:t>
+            </w:r>
+          </w:p>
+        </w:tc>
+        <w:tc>
+          <w:tcPr>
+            <w:tcW w:type="dxa" w:w="2409"/>
+          </w:tcPr>
+          <w:p>
+            <w:r>
+              <w:t>템플릿 폴백</w:t>
+            </w:r>
+          </w:p>
+        </w:tc>
+      </w:tr>
+      <w:tr>
+        <w:tc>
+          <w:tcPr>
+            <w:tcW w:type="dxa" w:w="2409"/>
+          </w:tcPr>
+          <w:p>
+            <w:r>
+              <w:t>매칭추천</w:t>
+            </w:r>
+          </w:p>
+        </w:tc>
+        <w:tc>
+          <w:tcPr>
+            <w:tcW w:type="dxa" w:w="2409"/>
+          </w:tcPr>
+          <w:p>
+            <w:r>
+              <w:t>rule-v3 / L2R 순위</w:t>
+            </w:r>
+          </w:p>
+        </w:tc>
+        <w:tc>
+          <w:tcPr>
+            <w:tcW w:type="dxa" w:w="2409"/>
+          </w:tcPr>
+          <w:p>
+            <w:r>
+              <w:t>1순위 추천 사유 설명</w:t>
+            </w:r>
+          </w:p>
+        </w:tc>
+        <w:tc>
+          <w:tcPr>
+            <w:tcW w:type="dxa" w:w="2409"/>
+          </w:tcPr>
+          <w:p>
+            <w:r>
+              <w:t>설명만 생략</w:t>
+            </w:r>
+          </w:p>
+        </w:tc>
+      </w:tr>
+      <w:tr>
+        <w:tc>
+          <w:tcPr>
+            <w:tcW w:type="dxa" w:w="2409"/>
+          </w:tcPr>
+          <w:p>
+            <w:r>
+              <w:t>산후매칭</w:t>
+            </w:r>
+          </w:p>
+        </w:tc>
+        <w:tc>
+          <w:tcPr>
+            <w:tcW w:type="dxa" w:w="2409"/>
+          </w:tcPr>
+          <w:p>
+            <w:r>
+              <w:t>rule-v1 순위(DB직결)</w:t>
+            </w:r>
+          </w:p>
+        </w:tc>
+        <w:tc>
+          <w:tcPr>
+            <w:tcW w:type="dxa" w:w="2409"/>
+          </w:tcPr>
+          <w:p>
+            <w:r>
+              <w:t>1순위 추천 사유 설명</w:t>
+            </w:r>
+          </w:p>
+        </w:tc>
+        <w:tc>
+          <w:tcPr>
+            <w:tcW w:type="dxa" w:w="2409"/>
+          </w:tcPr>
+          <w:p>
+            <w:r>
+              <w:t>설명만 생략</w:t>
+            </w:r>
+          </w:p>
+        </w:tc>
+      </w:tr>
+      <w:tr>
+        <w:tc>
+          <w:tcPr>
+            <w:tcW w:type="dxa" w:w="2409"/>
+          </w:tcPr>
+          <w:p>
+            <w:r>
+              <w:t>이상징후</w:t>
+            </w:r>
+          </w:p>
+        </w:tc>
+        <w:tc>
+          <w:tcPr>
+            <w:tcW w:type="dxa" w:w="2409"/>
+          </w:tcPr>
+          <w:p>
+            <w:r>
+              <w:t>rule-v1 위험 점수·심각도</w:t>
+            </w:r>
+          </w:p>
+        </w:tc>
+        <w:tc>
+          <w:tcPr>
+            <w:tcW w:type="dxa" w:w="2409"/>
+          </w:tcPr>
+          <w:p>
+            <w:r>
+              <w:t>보호자용 설명</w:t>
+            </w:r>
+          </w:p>
+        </w:tc>
+        <w:tc>
+          <w:tcPr>
+            <w:tcW w:type="dxa" w:w="2409"/>
+          </w:tcPr>
+          <w:p>
+            <w:r>
+              <w:t>설명만 생략</w:t>
+            </w:r>
+          </w:p>
+        </w:tc>
+      </w:tr>
+      <w:tr>
+        <w:tc>
+          <w:tcPr>
+            <w:tcW w:type="dxa" w:w="2409"/>
+          </w:tcPr>
+          <w:p>
+            <w:r>
+              <w:t>수요예측</w:t>
+            </w:r>
+          </w:p>
+        </w:tc>
+        <w:tc>
+          <w:tcPr>
+            <w:tcW w:type="dxa" w:w="2409"/>
+          </w:tcPr>
+          <w:p>
+            <w:r>
+              <w:t>seasonal-naive 통계</w:t>
+            </w:r>
+          </w:p>
+        </w:tc>
+        <w:tc>
+          <w:tcPr>
+            <w:tcW w:type="dxa" w:w="2409"/>
+          </w:tcPr>
+          <w:p>
+            <w:r>
+              <w:t>운영자 인사이트</w:t>
+            </w:r>
+          </w:p>
+        </w:tc>
+        <w:tc>
+          <w:tcPr>
+            <w:tcW w:type="dxa" w:w="2409"/>
+          </w:tcPr>
+          <w:p>
+            <w:r>
+              <w:t>인사이트만 생략</w:t>
+            </w:r>
+          </w:p>
+        </w:tc>
+      </w:tr>
+      <w:tr>
+        <w:tc>
+          <w:tcPr>
+            <w:tcW w:type="dxa" w:w="2409"/>
+          </w:tcPr>
+          <w:p>
+            <w:r>
+              <w:t>STT</w:t>
+            </w:r>
+          </w:p>
+        </w:tc>
+        <w:tc>
+          <w:tcPr>
+            <w:tcW w:type="dxa" w:w="2409"/>
+          </w:tcPr>
+          <w:p>
+            <w:r>
+              <w:t>faster-whisper(로컬, 기본)</w:t>
+            </w:r>
+          </w:p>
+        </w:tc>
+        <w:tc>
+          <w:tcPr>
+            <w:tcW w:type="dxa" w:w="2409"/>
+          </w:tcPr>
+          <w:p>
+            <w:r>
+              <w:t>멀티모달 전사(옵션)</w:t>
+            </w:r>
+          </w:p>
+        </w:tc>
+        <w:tc>
+          <w:tcPr>
+            <w:tcW w:type="dxa" w:w="2409"/>
+          </w:tcPr>
+          <w:p>
+            <w:r>
+              <w:t>—(엔진 택1)</w:t>
+            </w:r>
+          </w:p>
+        </w:tc>
+      </w:tr>
+    </w:tbl>
+    <w:p>
+      <w:pPr>
+        <w:pStyle w:val="Heading2"/>
+      </w:pPr>
+      <w:r>
+        <w:rPr>
+          <w:b w:val="0"/>
+        </w:rPr>
+        <w:t>4.3 동시 적용 방식 · 공통 메커니즘</w:t>
+      </w:r>
+    </w:p>
+    <w:p>
+      <w:pPr/>
+      <w:r>
+        <w:rPr>
+          <w:b w:val="0"/>
+        </w:rPr>
+        <w:t>•  하이브리드는 한 응답에 코어 필드와 Gemini 필드가 공존한다. 예) 이상징후 = risk_type/severity/risk_score·model=rule-v1(규칙 판정) + guardian_explanation/explanation_model=gemini-2.5-flash(설명). 규칙이 먼저 판정하고, 그 결과를 입력으로 Gemini가 설명 필드만 추가한다.</w:t>
+      </w:r>
+    </w:p>
+    <w:p>
+      <w:pPr/>
+      <w:r>
+        <w:rPr>
+          <w:b w:val="0"/>
+        </w:rPr>
+        <w:t>•  프로바이더 스위치: LLM_PROVIDER(anthropic|gemini)로 llm_complete()가 분기. 현재 gemini-2.5-flash.</w:t>
+      </w:r>
+    </w:p>
+    <w:p>
+      <w:pPr/>
+      <w:r>
+        <w:rPr>
+          <w:b w:val="0"/>
+        </w:rPr>
+        <w:t>•  thinking off(thinkingBudget=0): Gemini 2.5의 thinking이 출력 토큰을 잠식하는 문제를 방지.</w:t>
+      </w:r>
+    </w:p>
+    <w:p>
+      <w:pPr/>
+      <w:r>
+        <w:t>•  견고성: 일시오류(429/500/503) 백오프 재시도, 마크다운 코드펜스 자동 제거.</w:t>
+      </w:r>
+    </w:p>
+    <w:p>
+      <w:pPr/>
+      <w:r>
+        <w:rPr>
+          <w:b w:val="0"/>
+        </w:rPr>
+        <w:t>•  graceful degradation: 순수 생성은 규칙/템플릿 폴백, 하이브리드는 설명만 생략 — 코어·서비스는 절대 멈추지 않는다.</w:t>
+      </w:r>
+    </w:p>
+    <w:p>
+      <w:pPr/>
+      <w:r>
+        <w:rPr>
+          <w:b w:val="0"/>
+        </w:rPr>
+        <w:t>•  환각 차단: 하이브리드 프롬프트가 '규칙이 준 범위 안에서만, 새 수치·위험을 지어내지 말 것'을 명시.</w:t>
+      </w:r>
+    </w:p>
+    <w:p>
+      <w:pPr>
+        <w:pStyle w:val="Heading2"/>
+      </w:pPr>
+      <w:r>
+        <w:rPr>
+          <w:b w:val="0"/>
+        </w:rPr>
+        <w:t>4.4 설계 판단</w:t>
+      </w:r>
+    </w:p>
+    <w:p>
+      <w:pPr/>
+      <w:r>
+        <w:rPr>
+          <w:b w:val="0"/>
+        </w:rPr>
+        <w:t>•  위험 판정·순위·예측 등 재현 가능해야 하는 부분은 규칙/통계로 유지(환각이 치명적).</w:t>
+      </w:r>
+    </w:p>
+    <w:p>
+      <w:pPr/>
+      <w:r>
+        <w:rPr>
+          <w:b w:val="0"/>
+        </w:rPr>
+        <w:t>•  STT는 케어 음성이 어르신 건강 PII이므로 로컬 whisper를 기본 유지(Gemini STT는 녹음을 Google로 전송, 인라인 ~19MB 한도).</w:t>
+      </w:r>
+    </w:p>
+    <w:p>
+      <w:pPr/>
+      <w:r>
+        <w:rPr>
+          <w:b w:val="0"/>
+        </w:rPr>
+        <w:t>•  Gemini는 사람이 읽는 부분(설명·상담·요약·생성·전사)에만 적용해 안전과 UX를 동시에 확보.</w:t>
       </w:r>
     </w:p>
     <w:p>
@@ -1588,10 +2268,7 @@
         <w:spacing w:after="140" w:line="276" w:lineRule="auto"/>
       </w:pPr>
       <w:r>
-        <w:rPr>
-          <w:rFonts w:ascii="맑은 고딕" w:hAnsi="맑은 고딕" w:eastAsia="맑은 고딕"/>
-        </w:rPr>
-        <w:t xml:space="preserve">4. 공통 운영 정보</w:t>
+        <w:t>5. 공통 운영 정보</w:t>
       </w:r>
     </w:p>
     <w:p>

</xml_diff>

<commit_message>
docs: 전 설계서 도메인 표기 careand.aiclaude.kr → caren.aiclaude.kr
6개 docx + CAREAND-SYSTEM(gen 스크립트) 도메인 URL 정정, PDF 전체 재생성
(동일 디자인 변환기), 병합본 재구성(24p). careand.aiclaude 0건 검증.

Co-Authored-By: Claude Opus 4.8 (1M context) <noreply@anthropic.com>
</commit_message>
<xml_diff>
--- a/CareAnd-AI-설계문서-통합본.docx
+++ b/CareAnd-AI-설계문서-통합본.docx
@@ -97,7 +97,7 @@
           <w:sz w:val="20"/>
           <w:szCs w:val="20"/>
         </w:rPr>
-        <w:t xml:space="preserve">careand.aiclaude.kr   ·   2026-06-27   ·   v1.0</w:t>
+        <w:t>caren.aiclaude.kr   ·   2026-06-27   ·   v1.0</w:t>
       </w:r>
     </w:p>
     <w:p>
@@ -142,7 +142,7 @@
         <w:rPr>
           <w:b w:val="0"/>
         </w:rPr>
-        <w:t>Care&amp; 통합돌봄 플랫폼은 서버 103.55.191.157의 Apache 가상호스트(careand.aiclaude.kr)에서 구동된다. 백엔드(Laravel)·웹 3종(Next.js)·AI 서비스(FastAPI)·큐 워커가 모두 systemd로 상시 가동되며, 데이터는 MySQL(careand_platform, 약 66개 테이블)과 Redis(캐시·큐·세션)에 저장된다.</w:t>
+        <w:t>Care&amp; 통합돌봄 플랫폼은 서버 103.55.191.157의 Apache 가상호스트(caren.aiclaude.kr)에서 구동된다. 백엔드(Laravel)·웹 3종(Next.js)·AI 서비스(FastAPI)·큐 워커가 모두 systemd로 상시 가동되며, 데이터는 MySQL(careand_platform, 약 66개 테이블)과 Redis(캐시·큐·세션)에 저장된다.</w:t>
       </w:r>
     </w:p>
     <w:tbl>

</xml_diff>